<commit_message>
entrega(bruna): pacote e roteiro de 24/09 (tarde)
Substitui os de 24/09 de manha, que a Bruna ainda nao recebeu. O roteiro
da manha dizia que a BRENDA virou pendencia; com a CCO fora da regra
Oracle x SYSTUR ela deixou de ser.

- UPDATE_BRUNA_v1.0.0_2026-09-24.zip: exes de bb84d84.
- UPDATE_BRUNA_COM_BANCO_v1.0.0_2026-09-24.zip: + banco da base de 15/09
  reprocessado com o mesmo codigo (74,3 MB, integrity ok, sem INTERACOES).
- ROTEIRO_AJUSTES_CVC_IAM_2026-09-24: os 8 pontos de 22/09 com os numeros
  corrigidos + o documento Sistema_24_09 + os ajustes do dia (2.1 a 2.7).
- confere_pacote: um marcador novo por regra da tarde. Os dois zips
  APROVADOS (index == HEAD, 16/16 no painel, 22 dentro dos exes).

Co-Authored-By: Claude Opus 5.5 (1M context) <noreply@anthropic.com>
</commit_message>
<xml_diff>
--- a/ENTREGA/ROTEIRO_AJUSTES_CVC_IAM_2026-09-24.docx
+++ b/ENTREGA/ROTEIRO_AJUSTES_CVC_IAM_2026-09-24.docx
@@ -21,7 +21,7 @@
           <w:color w:val="5A6478"/>
           <w:sz w:val="26"/>
         </w:rPr>
-        <w:t>Roteiro de validação — os 8 pontos do seu documento de 22/09</w:t>
+        <w:t>Roteiro de validação — seus documentos de 22/09 e 24/09</w:t>
       </w:r>
     </w:p>
     <w:p>
@@ -64,7 +64,7 @@
           <w:color w:val="2C3340"/>
           <w:sz w:val="20"/>
         </w:rPr>
-        <w:t>Ele responde, um a um, os oito pontos do seu documento de 22/09 — as nove páginas, incluindo as que eram só imagem. Cada item diz o que mudou, como conferir e o valor esperado na sua base.</w:t>
+        <w:t>Ele responde, um a um, os oito pontos do seu documento de 22/09 — as nove páginas, incluindo as que eram só imagem — e os do seu documento de 24/09 (Sistema_24_09). Cada item diz o que mudou, como conferir e o valor esperado na sua base.</w:t>
       </w:r>
     </w:p>
     <w:p>
@@ -92,7 +92,7 @@
           <w:color w:val="2C3340"/>
           <w:sz w:val="20"/>
         </w:rPr>
-        <w:t>Esta entrega tira da tela acessos que não deveriam estar lá, então o total cai de 14.176 para 11.732 linhas. Isso é o efeito pretendido: 2.929 dessas linhas vinham de uma FUNÇÃO que não é a da pessoa (o ponto que você levantou no SIG). As pendências, ao contrário, SOBEM — de 1.151 para 1.289 pessoas —, porque passamos a cobrar casos que antes passavam batidos.</w:t>
+        <w:t>Esta entrega tira da tela acessos que não deveriam estar lá, então o total cai de 14.176 para 12.310 linhas. Isso é o efeito pretendido: boa parte dessas linhas vinha de uma FUNÇÃO que não é a da pessoa (o ponto que você levantou no SIG). As pendências, ao contrário, SOBEM — de 1.151 para 1.278 pessoas —, porque passamos a cobrar casos que antes passavam batidos.</w:t>
       </w:r>
     </w:p>
     <w:p>
@@ -197,7 +197,7 @@
         <w:rPr>
           <w:color w:val="1F2D5C"/>
         </w:rPr>
-        <w:t>1. Os oito pontos do seu documento</w:t>
+        <w:t>1. Os oito pontos do seu documento de 22/09</w:t>
       </w:r>
     </w:p>
     <w:p>
@@ -720,7 +720,7 @@
                 <w:color w:val="1E7B43"/>
                 <w:sz w:val="18"/>
               </w:rPr>
-              <w:t>Oracle EBS aderente com os QUATRO perfis da função dela (CVC AP NOVA VISUAL / AP BRASIL / AP SUBMARINO / AP VISUAL Consulta). Na base: 190 pessoas com Oracle e sem perfil no SYSTUR, 81 com acesso fora do que o perfil delas prevê, e o “incluir” do Oracle cai de 354 para 244 pessoas.</w:t>
+              <w:t>Oracle EBS aderente com os QUATRO perfis da função dela (CVC AP NOVA VISUAL / AP BRASIL / AP SUBMARINO / AP VISUAL Consulta). Na base: 185 pessoas com Oracle e sem perfil no SYSTUR, 68 com acesso fora do que o perfil delas prevê, e o “incluir” do Oracle cai de 354 para 233 pessoas. Quem é do Mapeamento CCO não passa por esta regra (item 2.1).</w:t>
             </w:r>
           </w:p>
         </w:tc>
@@ -1092,7 +1092,7 @@
                 <w:color w:val="1E7B43"/>
                 <w:sz w:val="18"/>
               </w:rPr>
-              <w:t>Nenhuma linha de SIG (eram 14, vindas da função “A Receber 2 + SIG”, que não é a dela). Na base: 2.929 linhas de outra função saíram — SIG 2.244, SIGOT 336, SICA RA 199, SICA Esfera 143 —, afetando 196 pessoas. Nenhuma pessoa entrou nem saiu da fila de pendências por causa disso.</w:t>
+              <w:t>Nenhuma linha de SIG cobrada (eram 14, vindas da função “A Receber 2 + SIG”, que não é a dela). As outras funções da equipe continuam visíveis como “o que ela pode ter” (item 2.4). Na base: 2.929 linhas de outra função saíram da cobrança — SIG 2.244, SIGOT 336, SICA RA 199, SICA Esfera 143 —, afetando 196 pessoas.</w:t>
             </w:r>
           </w:p>
         </w:tc>
@@ -1701,7 +1701,1325 @@
         <w:rPr>
           <w:color w:val="1F2D5C"/>
         </w:rPr>
-        <w:t>2. O que vai parecer diferente — e por quê</w:t>
+        <w:t>2. Seu documento de 24/09 e os ajustes do dia</w:t>
+      </w:r>
+    </w:p>
+    <w:p>
+      <w:pPr>
+        <w:spacing w:before="220" w:after="40"/>
+      </w:pPr>
+      <w:r>
+        <w:rPr>
+          <w:b/>
+          <w:color w:val="1F2D5C"/>
+          <w:sz w:val="21"/>
+        </w:rPr>
+        <w:t>★  2.1  Quem é do Mapeamento CCO não passa pela regra Oracle x SYSTUR</w:t>
+      </w:r>
+    </w:p>
+    <w:tbl>
+      <w:tblPr>
+        <w:tblStyle w:val="TableGrid"/>
+        <w:tblW w:type="auto" w:w="0"/>
+        <w:jc w:val="left"/>
+        <w:tblLook w:firstColumn="1" w:firstRow="1" w:lastColumn="0" w:lastRow="0" w:noHBand="0" w:noVBand="1" w:val="04A0"/>
+      </w:tblPr>
+      <w:tblGrid>
+        <w:gridCol w:w="4320"/>
+        <w:gridCol w:w="4320"/>
+      </w:tblGrid>
+      <w:tr>
+        <w:tc>
+          <w:tcPr>
+            <w:tcW w:type="dxa" w:w="2608"/>
+            <w:shd w:val="clear" w:color="auto" w:fill="EEF2F8"/>
+          </w:tcPr>
+          <w:p>
+            <w:r>
+              <w:rPr>
+                <w:b/>
+                <w:color w:val="1F2D5C"/>
+                <w:sz w:val="17"/>
+              </w:rPr>
+              <w:t>O que decide</w:t>
+            </w:r>
+          </w:p>
+        </w:tc>
+        <w:tc>
+          <w:tcPr>
+            <w:tcW w:type="dxa" w:w="6746"/>
+          </w:tcPr>
+          <w:p>
+            <w:r>
+              <w:rPr>
+                <w:color w:val="2C3340"/>
+                <w:sz w:val="18"/>
+              </w:rPr>
+              <w:t>Se o Oracle de quem está no CCO depende do perfil do SYSTUR.</w:t>
+            </w:r>
+          </w:p>
+        </w:tc>
+      </w:tr>
+      <w:tr>
+        <w:tc>
+          <w:tcPr>
+            <w:tcW w:type="dxa" w:w="2608"/>
+            <w:shd w:val="clear" w:color="auto" w:fill="EEF2F8"/>
+          </w:tcPr>
+          <w:p>
+            <w:r>
+              <w:rPr>
+                <w:b/>
+                <w:color w:val="1F2D5C"/>
+                <w:sz w:val="17"/>
+              </w:rPr>
+              <w:t>Critério</w:t>
+            </w:r>
+          </w:p>
+        </w:tc>
+        <w:tc>
+          <w:tcPr>
+            <w:tcW w:type="dxa" w:w="6746"/>
+          </w:tcPr>
+          <w:p>
+            <w:r>
+              <w:rPr>
+                <w:color w:val="2C3340"/>
+                <w:sz w:val="18"/>
+              </w:rPr>
+              <w:t>Para quem está no Mapeamento CCO (centro de custo + gestor), o Oracle é comparado direto com o que o CCO prevê, sem o filtro pelo perfil do SYSTUR e sem as pendências “sem perfil no SYSTUR” e “perfil fora do SYSTUR”. São 57 das 457 pessoas com Oracle.</w:t>
+            </w:r>
+          </w:p>
+        </w:tc>
+      </w:tr>
+      <w:tr>
+        <w:tc>
+          <w:tcPr>
+            <w:tcW w:type="dxa" w:w="2608"/>
+            <w:shd w:val="clear" w:color="auto" w:fill="EEF2F8"/>
+          </w:tcPr>
+          <w:p>
+            <w:r>
+              <w:rPr>
+                <w:b/>
+                <w:color w:val="1F2D5C"/>
+                <w:sz w:val="17"/>
+              </w:rPr>
+              <w:t>Como conferir</w:t>
+            </w:r>
+          </w:p>
+        </w:tc>
+        <w:tc>
+          <w:tcPr>
+            <w:tcW w:type="dxa" w:w="6746"/>
+          </w:tcPr>
+          <w:p>
+            <w:r>
+              <w:rPr>
+                <w:color w:val="2C3340"/>
+                <w:sz w:val="18"/>
+              </w:rPr>
+              <w:t>Consulta → BRENDA VASCONCELOS DERENCIO (34530984).</w:t>
+            </w:r>
+          </w:p>
+        </w:tc>
+      </w:tr>
+      <w:tr>
+        <w:tc>
+          <w:tcPr>
+            <w:tcW w:type="dxa" w:w="2608"/>
+            <w:shd w:val="clear" w:color="auto" w:fill="EEF2F8"/>
+          </w:tcPr>
+          <w:p>
+            <w:r>
+              <w:rPr>
+                <w:b/>
+                <w:color w:val="1F2D5C"/>
+                <w:sz w:val="17"/>
+              </w:rPr>
+              <w:t>Deve mostrar (vale em qualquer base)</w:t>
+            </w:r>
+          </w:p>
+        </w:tc>
+        <w:tc>
+          <w:tcPr>
+            <w:tcW w:type="dxa" w:w="6746"/>
+          </w:tcPr>
+          <w:p>
+            <w:r>
+              <w:rPr>
+                <w:b/>
+                <w:color w:val="1E7B43"/>
+                <w:sz w:val="18"/>
+              </w:rPr>
+              <w:t>Oracle EBS aderente — tem os 6 perfis da função dela; o CVC OIE BRASIL - Relatório de Despesas aparece como “1 a mais”, informativo. Ela não é pendência.</w:t>
+            </w:r>
+          </w:p>
+        </w:tc>
+      </w:tr>
+      <w:tr>
+        <w:tc>
+          <w:tcPr>
+            <w:tcW w:type="dxa" w:w="2608"/>
+            <w:shd w:val="clear" w:color="auto" w:fill="1F2D5C"/>
+          </w:tcPr>
+          <w:p>
+            <w:r>
+              <w:rPr>
+                <w:b/>
+                <w:color w:val="FFFFFF"/>
+                <w:sz w:val="17"/>
+              </w:rPr>
+              <w:t>A regra está correta? Se não, qual deveria ser?</w:t>
+            </w:r>
+          </w:p>
+        </w:tc>
+        <w:tc>
+          <w:tcPr>
+            <w:tcW w:type="dxa" w:w="6746"/>
+            <w:shd w:val="clear" w:color="auto" w:fill="FCF9EE"/>
+          </w:tcPr>
+          <w:p>
+            <w:r>
+              <w:rPr>
+                <w:color w:val="2C3340"/>
+                <w:sz w:val="18"/>
+              </w:rPr>
+            </w:r>
+          </w:p>
+        </w:tc>
+      </w:tr>
+    </w:tbl>
+    <w:p>
+      <w:pPr>
+        <w:spacing w:before="220" w:after="40"/>
+      </w:pPr>
+      <w:r>
+        <w:rPr>
+          <w:b/>
+          <w:color w:val="1F2D5C"/>
+          <w:sz w:val="21"/>
+        </w:rPr>
+        <w:t>2.2  “Não tem mapeado na matriz”</w:t>
+      </w:r>
+    </w:p>
+    <w:tbl>
+      <w:tblPr>
+        <w:tblStyle w:val="TableGrid"/>
+        <w:tblW w:type="auto" w:w="0"/>
+        <w:jc w:val="left"/>
+        <w:tblLook w:firstColumn="1" w:firstRow="1" w:lastColumn="0" w:lastRow="0" w:noHBand="0" w:noVBand="1" w:val="04A0"/>
+      </w:tblPr>
+      <w:tblGrid>
+        <w:gridCol w:w="4320"/>
+        <w:gridCol w:w="4320"/>
+      </w:tblGrid>
+      <w:tr>
+        <w:tc>
+          <w:tcPr>
+            <w:tcW w:type="dxa" w:w="2608"/>
+            <w:shd w:val="clear" w:color="auto" w:fill="EEF2F8"/>
+          </w:tcPr>
+          <w:p>
+            <w:r>
+              <w:rPr>
+                <w:b/>
+                <w:color w:val="1F2D5C"/>
+                <w:sz w:val="17"/>
+              </w:rPr>
+              <w:t>O que decide</w:t>
+            </w:r>
+          </w:p>
+        </w:tc>
+        <w:tc>
+          <w:tcPr>
+            <w:tcW w:type="dxa" w:w="6746"/>
+          </w:tcPr>
+          <w:p>
+            <w:r>
+              <w:rPr>
+                <w:color w:val="2C3340"/>
+                <w:sz w:val="18"/>
+              </w:rPr>
+              <w:t>O que aparece para quem é do CCO, não tem Oracle e só o CCO da equipe prevê Oracle.</w:t>
+            </w:r>
+          </w:p>
+        </w:tc>
+      </w:tr>
+      <w:tr>
+        <w:tc>
+          <w:tcPr>
+            <w:tcW w:type="dxa" w:w="2608"/>
+            <w:shd w:val="clear" w:color="auto" w:fill="EEF2F8"/>
+          </w:tcPr>
+          <w:p>
+            <w:r>
+              <w:rPr>
+                <w:b/>
+                <w:color w:val="1F2D5C"/>
+                <w:sz w:val="17"/>
+              </w:rPr>
+              <w:t>Critério</w:t>
+            </w:r>
+          </w:p>
+        </w:tc>
+        <w:tc>
+          <w:tcPr>
+            <w:tcW w:type="dxa" w:w="6746"/>
+          </w:tcPr>
+          <w:p>
+            <w:r>
+              <w:rPr>
+                <w:color w:val="2C3340"/>
+                <w:sz w:val="18"/>
+              </w:rPr>
+              <w:t>Seu pedido: colocar que não tem mapeado na matriz. Em vez de sugerir incluir, a linha é informativa e diz isso — dentro da função, com cada perfil, e no bloco “Sem mapeamento”. A função passa a mostrar quantos perfis ficaram de fora da conta, para não dizer “completa” com metade dos acessos.</w:t>
+            </w:r>
+          </w:p>
+        </w:tc>
+      </w:tr>
+      <w:tr>
+        <w:tc>
+          <w:tcPr>
+            <w:tcW w:type="dxa" w:w="2608"/>
+            <w:shd w:val="clear" w:color="auto" w:fill="EEF2F8"/>
+          </w:tcPr>
+          <w:p>
+            <w:r>
+              <w:rPr>
+                <w:b/>
+                <w:color w:val="1F2D5C"/>
+                <w:sz w:val="17"/>
+              </w:rPr>
+              <w:t>Como conferir</w:t>
+            </w:r>
+          </w:p>
+        </w:tc>
+        <w:tc>
+          <w:tcPr>
+            <w:tcW w:type="dxa" w:w="6746"/>
+          </w:tcPr>
+          <w:p>
+            <w:r>
+              <w:rPr>
+                <w:color w:val="2C3340"/>
+                <w:sz w:val="18"/>
+              </w:rPr>
+              <w:t>Consulta → ROSE APARECIDA DIOGO (2752).</w:t>
+            </w:r>
+          </w:p>
+        </w:tc>
+      </w:tr>
+      <w:tr>
+        <w:tc>
+          <w:tcPr>
+            <w:tcW w:type="dxa" w:w="2608"/>
+            <w:shd w:val="clear" w:color="auto" w:fill="EEF2F8"/>
+          </w:tcPr>
+          <w:p>
+            <w:r>
+              <w:rPr>
+                <w:b/>
+                <w:color w:val="1F2D5C"/>
+                <w:sz w:val="17"/>
+              </w:rPr>
+              <w:t>Deve mostrar (vale em qualquer base)</w:t>
+            </w:r>
+          </w:p>
+        </w:tc>
+        <w:tc>
+          <w:tcPr>
+            <w:tcW w:type="dxa" w:w="6746"/>
+          </w:tcPr>
+          <w:p>
+            <w:r>
+              <w:rPr>
+                <w:b/>
+                <w:color w:val="1E7B43"/>
+                <w:sz w:val="18"/>
+              </w:rPr>
+              <w:t>Oracle: “não tem mapeado na matriz — a previsão vem só da CCO da equipe”. A função “Atendimento a fornecedores CVC e VISUAL” mostra “completa · 4 não mapeados na matriz”. Na base: 61 pessoas.</w:t>
+            </w:r>
+          </w:p>
+        </w:tc>
+      </w:tr>
+      <w:tr>
+        <w:tc>
+          <w:tcPr>
+            <w:tcW w:type="dxa" w:w="2608"/>
+            <w:shd w:val="clear" w:color="auto" w:fill="1F2D5C"/>
+          </w:tcPr>
+          <w:p>
+            <w:r>
+              <w:rPr>
+                <w:b/>
+                <w:color w:val="FFFFFF"/>
+                <w:sz w:val="17"/>
+              </w:rPr>
+              <w:t>A regra está correta? Se não, qual deveria ser?</w:t>
+            </w:r>
+          </w:p>
+        </w:tc>
+        <w:tc>
+          <w:tcPr>
+            <w:tcW w:type="dxa" w:w="6746"/>
+            <w:shd w:val="clear" w:color="auto" w:fill="FCF9EE"/>
+          </w:tcPr>
+          <w:p>
+            <w:r>
+              <w:rPr>
+                <w:color w:val="2C3340"/>
+                <w:sz w:val="18"/>
+              </w:rPr>
+            </w:r>
+          </w:p>
+        </w:tc>
+      </w:tr>
+    </w:tbl>
+    <w:p>
+      <w:pPr>
+        <w:spacing w:before="220" w:after="40"/>
+      </w:pPr>
+      <w:r>
+        <w:rPr>
+          <w:b/>
+          <w:color w:val="1F2D5C"/>
+          <w:sz w:val="21"/>
+        </w:rPr>
+        <w:t>2.3  Opera Operacional aparece pelo Mapeamento CCO</w:t>
+      </w:r>
+    </w:p>
+    <w:tbl>
+      <w:tblPr>
+        <w:tblStyle w:val="TableGrid"/>
+        <w:tblW w:type="auto" w:w="0"/>
+        <w:jc w:val="left"/>
+        <w:tblLook w:firstColumn="1" w:firstRow="1" w:lastColumn="0" w:lastRow="0" w:noHBand="0" w:noVBand="1" w:val="04A0"/>
+      </w:tblPr>
+      <w:tblGrid>
+        <w:gridCol w:w="4320"/>
+        <w:gridCol w:w="4320"/>
+      </w:tblGrid>
+      <w:tr>
+        <w:tc>
+          <w:tcPr>
+            <w:tcW w:type="dxa" w:w="2608"/>
+            <w:shd w:val="clear" w:color="auto" w:fill="EEF2F8"/>
+          </w:tcPr>
+          <w:p>
+            <w:r>
+              <w:rPr>
+                <w:b/>
+                <w:color w:val="1F2D5C"/>
+                <w:sz w:val="17"/>
+              </w:rPr>
+              <w:t>O que decide</w:t>
+            </w:r>
+          </w:p>
+        </w:tc>
+        <w:tc>
+          <w:tcPr>
+            <w:tcW w:type="dxa" w:w="6746"/>
+          </w:tcPr>
+          <w:p>
+            <w:r>
+              <w:rPr>
+                <w:color w:val="2C3340"/>
+                <w:sz w:val="18"/>
+              </w:rPr>
+              <w:t>Se o Opera Operacional aparece na aplicação.</w:t>
+            </w:r>
+          </w:p>
+        </w:tc>
+      </w:tr>
+      <w:tr>
+        <w:tc>
+          <w:tcPr>
+            <w:tcW w:type="dxa" w:w="2608"/>
+            <w:shd w:val="clear" w:color="auto" w:fill="EEF2F8"/>
+          </w:tcPr>
+          <w:p>
+            <w:r>
+              <w:rPr>
+                <w:b/>
+                <w:color w:val="1F2D5C"/>
+                <w:sz w:val="17"/>
+              </w:rPr>
+              <w:t>Critério</w:t>
+            </w:r>
+          </w:p>
+        </w:tc>
+        <w:tc>
+          <w:tcPr>
+            <w:tcW w:type="dxa" w:w="6746"/>
+          </w:tcPr>
+          <w:p>
+            <w:r>
+              <w:rPr>
+                <w:color w:val="2C3340"/>
+                <w:sz w:val="18"/>
+              </w:rPr>
+              <w:t>Não recebemos extrato do Opera, então não dá para conferir se a pessoa tem o acesso. O que o CCO prevê para a função dela aparece como informativo — nunca como pendência nem como “incluir”.</w:t>
+            </w:r>
+          </w:p>
+        </w:tc>
+      </w:tr>
+      <w:tr>
+        <w:tc>
+          <w:tcPr>
+            <w:tcW w:type="dxa" w:w="2608"/>
+            <w:shd w:val="clear" w:color="auto" w:fill="EEF2F8"/>
+          </w:tcPr>
+          <w:p>
+            <w:r>
+              <w:rPr>
+                <w:b/>
+                <w:color w:val="1F2D5C"/>
+                <w:sz w:val="17"/>
+              </w:rPr>
+              <w:t>Como conferir</w:t>
+            </w:r>
+          </w:p>
+        </w:tc>
+        <w:tc>
+          <w:tcPr>
+            <w:tcW w:type="dxa" w:w="6746"/>
+          </w:tcPr>
+          <w:p>
+            <w:r>
+              <w:rPr>
+                <w:color w:val="2C3340"/>
+                <w:sz w:val="18"/>
+              </w:rPr>
+              <w:t>Consulta → EDISON ALVES DO NASCIMENTO (1759) → Funções previstas → A Receber 2 + SIG.</w:t>
+            </w:r>
+          </w:p>
+        </w:tc>
+      </w:tr>
+      <w:tr>
+        <w:tc>
+          <w:tcPr>
+            <w:tcW w:type="dxa" w:w="2608"/>
+            <w:shd w:val="clear" w:color="auto" w:fill="EEF2F8"/>
+          </w:tcPr>
+          <w:p>
+            <w:r>
+              <w:rPr>
+                <w:b/>
+                <w:color w:val="1F2D5C"/>
+                <w:sz w:val="17"/>
+              </w:rPr>
+              <w:t>Deve mostrar (vale em qualquer base)</w:t>
+            </w:r>
+          </w:p>
+        </w:tc>
+        <w:tc>
+          <w:tcPr>
+            <w:tcW w:type="dxa" w:w="6746"/>
+          </w:tcPr>
+          <w:p>
+            <w:r>
+              <w:rPr>
+                <w:b/>
+                <w:color w:val="1E7B43"/>
+                <w:sz w:val="18"/>
+              </w:rPr>
+              <w:t>OPERA_OPERACIONAL · A_RECEBER_2 · “sem extrato”. Na base: 149 pessoas, 203 linhas.</w:t>
+            </w:r>
+          </w:p>
+        </w:tc>
+      </w:tr>
+      <w:tr>
+        <w:tc>
+          <w:tcPr>
+            <w:tcW w:type="dxa" w:w="2608"/>
+            <w:shd w:val="clear" w:color="auto" w:fill="1F2D5C"/>
+          </w:tcPr>
+          <w:p>
+            <w:r>
+              <w:rPr>
+                <w:b/>
+                <w:color w:val="FFFFFF"/>
+                <w:sz w:val="17"/>
+              </w:rPr>
+              <w:t>A regra está correta? Se não, qual deveria ser?</w:t>
+            </w:r>
+          </w:p>
+        </w:tc>
+        <w:tc>
+          <w:tcPr>
+            <w:tcW w:type="dxa" w:w="6746"/>
+            <w:shd w:val="clear" w:color="auto" w:fill="FCF9EE"/>
+          </w:tcPr>
+          <w:p>
+            <w:r>
+              <w:rPr>
+                <w:color w:val="2C3340"/>
+                <w:sz w:val="18"/>
+              </w:rPr>
+            </w:r>
+          </w:p>
+        </w:tc>
+      </w:tr>
+    </w:tbl>
+    <w:p>
+      <w:pPr>
+        <w:spacing w:before="220" w:after="40"/>
+      </w:pPr>
+      <w:r>
+        <w:rPr>
+          <w:b/>
+          <w:color w:val="1F2D5C"/>
+          <w:sz w:val="21"/>
+        </w:rPr>
+        <w:t>★  2.4  As outras funções da equipe que a pessoa pode ter</w:t>
+      </w:r>
+    </w:p>
+    <w:tbl>
+      <w:tblPr>
+        <w:tblStyle w:val="TableGrid"/>
+        <w:tblW w:type="auto" w:w="0"/>
+        <w:jc w:val="left"/>
+        <w:tblLook w:firstColumn="1" w:firstRow="1" w:lastColumn="0" w:lastRow="0" w:noHBand="0" w:noVBand="1" w:val="04A0"/>
+      </w:tblPr>
+      <w:tblGrid>
+        <w:gridCol w:w="4320"/>
+        <w:gridCol w:w="4320"/>
+      </w:tblGrid>
+      <w:tr>
+        <w:tc>
+          <w:tcPr>
+            <w:tcW w:type="dxa" w:w="2608"/>
+            <w:shd w:val="clear" w:color="auto" w:fill="EEF2F8"/>
+          </w:tcPr>
+          <w:p>
+            <w:r>
+              <w:rPr>
+                <w:b/>
+                <w:color w:val="1F2D5C"/>
+                <w:sz w:val="17"/>
+              </w:rPr>
+              <w:t>O que decide</w:t>
+            </w:r>
+          </w:p>
+        </w:tc>
+        <w:tc>
+          <w:tcPr>
+            <w:tcW w:type="dxa" w:w="6746"/>
+          </w:tcPr>
+          <w:p>
+            <w:r>
+              <w:rPr>
+                <w:color w:val="2C3340"/>
+                <w:sz w:val="18"/>
+              </w:rPr>
+              <w:t>O que aparece das funções do gestor que não são a da pessoa.</w:t>
+            </w:r>
+          </w:p>
+        </w:tc>
+      </w:tr>
+      <w:tr>
+        <w:tc>
+          <w:tcPr>
+            <w:tcW w:type="dxa" w:w="2608"/>
+            <w:shd w:val="clear" w:color="auto" w:fill="EEF2F8"/>
+          </w:tcPr>
+          <w:p>
+            <w:r>
+              <w:rPr>
+                <w:b/>
+                <w:color w:val="1F2D5C"/>
+                <w:sz w:val="17"/>
+              </w:rPr>
+              <w:t>Critério</w:t>
+            </w:r>
+          </w:p>
+        </w:tc>
+        <w:tc>
+          <w:tcPr>
+            <w:tcW w:type="dxa" w:w="6746"/>
+          </w:tcPr>
+          <w:p>
+            <w:r>
+              <w:rPr>
+                <w:color w:val="2C3340"/>
+                <w:sz w:val="18"/>
+              </w:rPr>
+              <w:t>O CCO lista todas as funções da equipe. A função da pessoa — a que o perfil do SYSTUR indica — é a cobrada. As demais aparecem logo abaixo, com cada acesso marcado “tem” / “não tem”, sem virar pendência. Quem não tem perfil no SYSTUR recebe todas as funções, como antes.</w:t>
+            </w:r>
+          </w:p>
+        </w:tc>
+      </w:tr>
+      <w:tr>
+        <w:tc>
+          <w:tcPr>
+            <w:tcW w:type="dxa" w:w="2608"/>
+            <w:shd w:val="clear" w:color="auto" w:fill="EEF2F8"/>
+          </w:tcPr>
+          <w:p>
+            <w:r>
+              <w:rPr>
+                <w:b/>
+                <w:color w:val="1F2D5C"/>
+                <w:sz w:val="17"/>
+              </w:rPr>
+              <w:t>Como conferir</w:t>
+            </w:r>
+          </w:p>
+        </w:tc>
+        <w:tc>
+          <w:tcPr>
+            <w:tcW w:type="dxa" w:w="6746"/>
+          </w:tcPr>
+          <w:p>
+            <w:r>
+              <w:rPr>
+                <w:color w:val="2C3340"/>
+                <w:sz w:val="18"/>
+              </w:rPr>
+              <w:t>Consulta → BRENDA VASCONCELOS DERENCIO (34530984) → final da aba Acessos.</w:t>
+            </w:r>
+          </w:p>
+        </w:tc>
+      </w:tr>
+      <w:tr>
+        <w:tc>
+          <w:tcPr>
+            <w:tcW w:type="dxa" w:w="2608"/>
+            <w:shd w:val="clear" w:color="auto" w:fill="EEF2F8"/>
+          </w:tcPr>
+          <w:p>
+            <w:r>
+              <w:rPr>
+                <w:b/>
+                <w:color w:val="1F2D5C"/>
+                <w:sz w:val="17"/>
+              </w:rPr>
+              <w:t>Deve mostrar (vale em qualquer base)</w:t>
+            </w:r>
+          </w:p>
+        </w:tc>
+        <w:tc>
+          <w:tcPr>
+            <w:tcW w:type="dxa" w:w="6746"/>
+          </w:tcPr>
+          <w:p>
+            <w:r>
+              <w:rPr>
+                <w:b/>
+                <w:color w:val="1E7B43"/>
+                <w:sz w:val="18"/>
+              </w:rPr>
+              <w:t>“Outras funções que a pessoa pode ter (3)”: A Receber 1 Comissão, A Receber 2 + SIG e A Receber 3. Na base: 374 pessoas têm o bloco.</w:t>
+            </w:r>
+          </w:p>
+        </w:tc>
+      </w:tr>
+      <w:tr>
+        <w:tc>
+          <w:tcPr>
+            <w:tcW w:type="dxa" w:w="2608"/>
+            <w:shd w:val="clear" w:color="auto" w:fill="1F2D5C"/>
+          </w:tcPr>
+          <w:p>
+            <w:r>
+              <w:rPr>
+                <w:b/>
+                <w:color w:val="FFFFFF"/>
+                <w:sz w:val="17"/>
+              </w:rPr>
+              <w:t>A regra está correta? Se não, qual deveria ser?</w:t>
+            </w:r>
+          </w:p>
+        </w:tc>
+        <w:tc>
+          <w:tcPr>
+            <w:tcW w:type="dxa" w:w="6746"/>
+            <w:shd w:val="clear" w:color="auto" w:fill="FCF9EE"/>
+          </w:tcPr>
+          <w:p>
+            <w:r>
+              <w:rPr>
+                <w:color w:val="2C3340"/>
+                <w:sz w:val="18"/>
+              </w:rPr>
+            </w:r>
+          </w:p>
+        </w:tc>
+      </w:tr>
+    </w:tbl>
+    <w:p>
+      <w:pPr>
+        <w:spacing w:before="220" w:after="40"/>
+      </w:pPr>
+      <w:r>
+        <w:rPr>
+          <w:b/>
+          <w:color w:val="1F2D5C"/>
+          <w:sz w:val="21"/>
+        </w:rPr>
+        <w:t>★  2.5  Um perfil por sistema: as outras opções não são “falta”</w:t>
+      </w:r>
+    </w:p>
+    <w:tbl>
+      <w:tblPr>
+        <w:tblStyle w:val="TableGrid"/>
+        <w:tblW w:type="auto" w:w="0"/>
+        <w:jc w:val="left"/>
+        <w:tblLook w:firstColumn="1" w:firstRow="1" w:lastColumn="0" w:lastRow="0" w:noHBand="0" w:noVBand="1" w:val="04A0"/>
+      </w:tblPr>
+      <w:tblGrid>
+        <w:gridCol w:w="4320"/>
+        <w:gridCol w:w="4320"/>
+      </w:tblGrid>
+      <w:tr>
+        <w:tc>
+          <w:tcPr>
+            <w:tcW w:type="dxa" w:w="2608"/>
+            <w:shd w:val="clear" w:color="auto" w:fill="EEF2F8"/>
+          </w:tcPr>
+          <w:p>
+            <w:r>
+              <w:rPr>
+                <w:b/>
+                <w:color w:val="1F2D5C"/>
+                <w:sz w:val="17"/>
+              </w:rPr>
+              <w:t>O que decide</w:t>
+            </w:r>
+          </w:p>
+        </w:tc>
+        <w:tc>
+          <w:tcPr>
+            <w:tcW w:type="dxa" w:w="6746"/>
+          </w:tcPr>
+          <w:p>
+            <w:r>
+              <w:rPr>
+                <w:color w:val="2C3340"/>
+                <w:sz w:val="18"/>
+              </w:rPr>
+              <w:t>Como aparece o sistema em que a matriz prevê mais de uma opção e a pessoa tem uma.</w:t>
+            </w:r>
+          </w:p>
+        </w:tc>
+      </w:tr>
+      <w:tr>
+        <w:tc>
+          <w:tcPr>
+            <w:tcW w:type="dxa" w:w="2608"/>
+            <w:shd w:val="clear" w:color="auto" w:fill="EEF2F8"/>
+          </w:tcPr>
+          <w:p>
+            <w:r>
+              <w:rPr>
+                <w:b/>
+                <w:color w:val="1F2D5C"/>
+                <w:sz w:val="17"/>
+              </w:rPr>
+              <w:t>Critério</w:t>
+            </w:r>
+          </w:p>
+        </w:tc>
+        <w:tc>
+          <w:tcPr>
+            <w:tcW w:type="dxa" w:w="6746"/>
+          </w:tcPr>
+          <w:p>
+            <w:r>
+              <w:rPr>
+                <w:color w:val="2C3340"/>
+                <w:sz w:val="18"/>
+              </w:rPr>
+              <w:t>Seu documento: “se um dos acessos mapeados estiver ok traz ele ok, e os a mais precisam ser trazidos estilo as funções do CCO”. O sistema vem aderente, sem “Falta 1”, e as outras opções vão para o bloco “Outros acessos previstos”. Uma opção aparece direto; mais de uma fica recolhida. Vale para todos os sistemas menos o Oracle, onde cada perfil é um acesso.</w:t>
+            </w:r>
+          </w:p>
+        </w:tc>
+      </w:tr>
+      <w:tr>
+        <w:tc>
+          <w:tcPr>
+            <w:tcW w:type="dxa" w:w="2608"/>
+            <w:shd w:val="clear" w:color="auto" w:fill="EEF2F8"/>
+          </w:tcPr>
+          <w:p>
+            <w:r>
+              <w:rPr>
+                <w:b/>
+                <w:color w:val="1F2D5C"/>
+                <w:sz w:val="17"/>
+              </w:rPr>
+              <w:t>Como conferir</w:t>
+            </w:r>
+          </w:p>
+        </w:tc>
+        <w:tc>
+          <w:tcPr>
+            <w:tcW w:type="dxa" w:w="6746"/>
+          </w:tcPr>
+          <w:p>
+            <w:r>
+              <w:rPr>
+                <w:color w:val="2C3340"/>
+                <w:sz w:val="18"/>
+              </w:rPr>
+              <w:t>Consulta → ROSELAINE DO NASCIMENTO FIGUEIREDO (34532575); depois CAIO LUIZ DA COSTA (34531299).</w:t>
+            </w:r>
+          </w:p>
+        </w:tc>
+      </w:tr>
+      <w:tr>
+        <w:tc>
+          <w:tcPr>
+            <w:tcW w:type="dxa" w:w="2608"/>
+            <w:shd w:val="clear" w:color="auto" w:fill="EEF2F8"/>
+          </w:tcPr>
+          <w:p>
+            <w:r>
+              <w:rPr>
+                <w:b/>
+                <w:color w:val="1F2D5C"/>
+                <w:sz w:val="17"/>
+              </w:rPr>
+              <w:t>Deve mostrar (vale em qualquer base)</w:t>
+            </w:r>
+          </w:p>
+        </w:tc>
+        <w:tc>
+          <w:tcPr>
+            <w:tcW w:type="dxa" w:w="6746"/>
+          </w:tcPr>
+          <w:p>
+            <w:r>
+              <w:rPr>
+                <w:b/>
+                <w:color w:val="1E7B43"/>
+                <w:sz w:val="18"/>
+              </w:rPr>
+              <w:t>Roselaine: SIGOT, SYSTUR e IC aderentes; em “Outros acessos previstos”, SIGOT Intercompany, SYSTUR INTERCOMPANY e IC IC_CADASTRO. Caio: “SYSTUR — 2 opções”, recolhido. Na base: 168 pessoas.</w:t>
+            </w:r>
+          </w:p>
+        </w:tc>
+      </w:tr>
+      <w:tr>
+        <w:tc>
+          <w:tcPr>
+            <w:tcW w:type="dxa" w:w="2608"/>
+            <w:shd w:val="clear" w:color="auto" w:fill="1F2D5C"/>
+          </w:tcPr>
+          <w:p>
+            <w:r>
+              <w:rPr>
+                <w:b/>
+                <w:color w:val="FFFFFF"/>
+                <w:sz w:val="17"/>
+              </w:rPr>
+              <w:t>A regra está correta? Se não, qual deveria ser?</w:t>
+            </w:r>
+          </w:p>
+        </w:tc>
+        <w:tc>
+          <w:tcPr>
+            <w:tcW w:type="dxa" w:w="6746"/>
+            <w:shd w:val="clear" w:color="auto" w:fill="FCF9EE"/>
+          </w:tcPr>
+          <w:p>
+            <w:r>
+              <w:rPr>
+                <w:color w:val="2C3340"/>
+                <w:sz w:val="18"/>
+              </w:rPr>
+            </w:r>
+          </w:p>
+        </w:tc>
+      </w:tr>
+    </w:tbl>
+    <w:p>
+      <w:pPr>
+        <w:spacing w:before="220" w:after="40"/>
+      </w:pPr>
+      <w:r>
+        <w:rPr>
+          <w:b/>
+          <w:color w:val="1F2D5C"/>
+          <w:sz w:val="21"/>
+        </w:rPr>
+        <w:t>★  2.6  “Não pode ter acesso e tem”</w:t>
+      </w:r>
+    </w:p>
+    <w:tbl>
+      <w:tblPr>
+        <w:tblStyle w:val="TableGrid"/>
+        <w:tblW w:type="auto" w:w="0"/>
+        <w:jc w:val="left"/>
+        <w:tblLook w:firstColumn="1" w:firstRow="1" w:lastColumn="0" w:lastRow="0" w:noHBand="0" w:noVBand="1" w:val="04A0"/>
+      </w:tblPr>
+      <w:tblGrid>
+        <w:gridCol w:w="4320"/>
+        <w:gridCol w:w="4320"/>
+      </w:tblGrid>
+      <w:tr>
+        <w:tc>
+          <w:tcPr>
+            <w:tcW w:type="dxa" w:w="2608"/>
+            <w:shd w:val="clear" w:color="auto" w:fill="EEF2F8"/>
+          </w:tcPr>
+          <w:p>
+            <w:r>
+              <w:rPr>
+                <w:b/>
+                <w:color w:val="1F2D5C"/>
+                <w:sz w:val="17"/>
+              </w:rPr>
+              <w:t>O que decide</w:t>
+            </w:r>
+          </w:p>
+        </w:tc>
+        <w:tc>
+          <w:tcPr>
+            <w:tcW w:type="dxa" w:w="6746"/>
+          </w:tcPr>
+          <w:p>
+            <w:r>
+              <w:rPr>
+                <w:color w:val="2C3340"/>
+                <w:sz w:val="18"/>
+              </w:rPr>
+              <w:t>O que aparece para quem tem acesso num sistema que nem a matriz nem o CCO preveem para ela.</w:t>
+            </w:r>
+          </w:p>
+        </w:tc>
+      </w:tr>
+      <w:tr>
+        <w:tc>
+          <w:tcPr>
+            <w:tcW w:type="dxa" w:w="2608"/>
+            <w:shd w:val="clear" w:color="auto" w:fill="EEF2F8"/>
+          </w:tcPr>
+          <w:p>
+            <w:r>
+              <w:rPr>
+                <w:b/>
+                <w:color w:val="1F2D5C"/>
+                <w:sz w:val="17"/>
+              </w:rPr>
+              <w:t>Critério</w:t>
+            </w:r>
+          </w:p>
+        </w:tc>
+        <w:tc>
+          <w:tcPr>
+            <w:tcW w:type="dxa" w:w="6746"/>
+          </w:tcPr>
+          <w:p>
+            <w:r>
+              <w:rPr>
+                <w:color w:val="2C3340"/>
+                <w:sz w:val="18"/>
+              </w:rPr>
+              <w:t>A tela dizia só “sem perfil previsto”, sem mostrar o acesso. Agora é pendência, com o perfil que a pessoa tem. Nas linhas de análise com um lado só, a tela diz qual é: “Deveria ter:” ou “Tem hoje:”.</w:t>
+            </w:r>
+          </w:p>
+        </w:tc>
+      </w:tr>
+      <w:tr>
+        <w:tc>
+          <w:tcPr>
+            <w:tcW w:type="dxa" w:w="2608"/>
+            <w:shd w:val="clear" w:color="auto" w:fill="EEF2F8"/>
+          </w:tcPr>
+          <w:p>
+            <w:r>
+              <w:rPr>
+                <w:b/>
+                <w:color w:val="1F2D5C"/>
+                <w:sz w:val="17"/>
+              </w:rPr>
+              <w:t>Como conferir</w:t>
+            </w:r>
+          </w:p>
+        </w:tc>
+        <w:tc>
+          <w:tcPr>
+            <w:tcW w:type="dxa" w:w="6746"/>
+          </w:tcPr>
+          <w:p>
+            <w:r>
+              <w:rPr>
+                <w:color w:val="2C3340"/>
+                <w:sz w:val="18"/>
+              </w:rPr>
+              <w:t>Consulta → DENISE APARECIDA GONCALVES DOS SANTOS (1562).</w:t>
+            </w:r>
+          </w:p>
+        </w:tc>
+      </w:tr>
+      <w:tr>
+        <w:tc>
+          <w:tcPr>
+            <w:tcW w:type="dxa" w:w="2608"/>
+            <w:shd w:val="clear" w:color="auto" w:fill="EEF2F8"/>
+          </w:tcPr>
+          <w:p>
+            <w:r>
+              <w:rPr>
+                <w:b/>
+                <w:color w:val="1F2D5C"/>
+                <w:sz w:val="17"/>
+              </w:rPr>
+              <w:t>Deve mostrar (vale em qualquer base)</w:t>
+            </w:r>
+          </w:p>
+        </w:tc>
+        <w:tc>
+          <w:tcPr>
+            <w:tcW w:type="dxa" w:w="6746"/>
+          </w:tcPr>
+          <w:p>
+            <w:r>
+              <w:rPr>
+                <w:b/>
+                <w:color w:val="1E7B43"/>
+                <w:sz w:val="18"/>
+              </w:rPr>
+              <w:t>Necessário análise: SYSTUR “Deveria ter: INTEGRADOR_CONTABIL” e IC “Tem hoje: IC_CADASTRO”. Na base: 7 pessoas.</w:t>
+            </w:r>
+          </w:p>
+        </w:tc>
+      </w:tr>
+      <w:tr>
+        <w:tc>
+          <w:tcPr>
+            <w:tcW w:type="dxa" w:w="2608"/>
+            <w:shd w:val="clear" w:color="auto" w:fill="1F2D5C"/>
+          </w:tcPr>
+          <w:p>
+            <w:r>
+              <w:rPr>
+                <w:b/>
+                <w:color w:val="FFFFFF"/>
+                <w:sz w:val="17"/>
+              </w:rPr>
+              <w:t>A regra está correta? Se não, qual deveria ser?</w:t>
+            </w:r>
+          </w:p>
+        </w:tc>
+        <w:tc>
+          <w:tcPr>
+            <w:tcW w:type="dxa" w:w="6746"/>
+            <w:shd w:val="clear" w:color="auto" w:fill="FCF9EE"/>
+          </w:tcPr>
+          <w:p>
+            <w:r>
+              <w:rPr>
+                <w:color w:val="2C3340"/>
+                <w:sz w:val="18"/>
+              </w:rPr>
+            </w:r>
+          </w:p>
+        </w:tc>
+      </w:tr>
+    </w:tbl>
+    <w:p>
+      <w:pPr>
+        <w:spacing w:before="220" w:after="40"/>
+      </w:pPr>
+      <w:r>
+        <w:rPr>
+          <w:b/>
+          <w:color w:val="1F2D5C"/>
+          <w:sz w:val="21"/>
+        </w:rPr>
+        <w:t>2.7  A função certa em cada acesso</w:t>
+      </w:r>
+    </w:p>
+    <w:tbl>
+      <w:tblPr>
+        <w:tblStyle w:val="TableGrid"/>
+        <w:tblW w:type="auto" w:w="0"/>
+        <w:jc w:val="left"/>
+        <w:tblLook w:firstColumn="1" w:firstRow="1" w:lastColumn="0" w:lastRow="0" w:noHBand="0" w:noVBand="1" w:val="04A0"/>
+      </w:tblPr>
+      <w:tblGrid>
+        <w:gridCol w:w="4320"/>
+        <w:gridCol w:w="4320"/>
+      </w:tblGrid>
+      <w:tr>
+        <w:tc>
+          <w:tcPr>
+            <w:tcW w:type="dxa" w:w="2608"/>
+            <w:shd w:val="clear" w:color="auto" w:fill="EEF2F8"/>
+          </w:tcPr>
+          <w:p>
+            <w:r>
+              <w:rPr>
+                <w:b/>
+                <w:color w:val="1F2D5C"/>
+                <w:sz w:val="17"/>
+              </w:rPr>
+              <w:t>O que decide</w:t>
+            </w:r>
+          </w:p>
+        </w:tc>
+        <w:tc>
+          <w:tcPr>
+            <w:tcW w:type="dxa" w:w="6746"/>
+          </w:tcPr>
+          <w:p>
+            <w:r>
+              <w:rPr>
+                <w:color w:val="2C3340"/>
+                <w:sz w:val="18"/>
+              </w:rPr>
+              <w:t>Em qual função do CCO cada acesso aparece.</w:t>
+            </w:r>
+          </w:p>
+        </w:tc>
+      </w:tr>
+      <w:tr>
+        <w:tc>
+          <w:tcPr>
+            <w:tcW w:type="dxa" w:w="2608"/>
+            <w:shd w:val="clear" w:color="auto" w:fill="EEF2F8"/>
+          </w:tcPr>
+          <w:p>
+            <w:r>
+              <w:rPr>
+                <w:b/>
+                <w:color w:val="1F2D5C"/>
+                <w:sz w:val="17"/>
+              </w:rPr>
+              <w:t>Critério</w:t>
+            </w:r>
+          </w:p>
+        </w:tc>
+        <w:tc>
+          <w:tcPr>
+            <w:tcW w:type="dxa" w:w="6746"/>
+          </w:tcPr>
+          <w:p>
+            <w:r>
+              <w:rPr>
+                <w:color w:val="2C3340"/>
+                <w:sz w:val="18"/>
+              </w:rPr>
+              <w:t>O mesmo perfil do Oracle está em várias funções da equipe, e a aplicação pegava a primeira da planilha. Agora vale a função que o SYSTUR da pessoa indica. Só muda o nome da função exibida; nenhum status muda.</w:t>
+            </w:r>
+          </w:p>
+        </w:tc>
+      </w:tr>
+      <w:tr>
+        <w:tc>
+          <w:tcPr>
+            <w:tcW w:type="dxa" w:w="2608"/>
+            <w:shd w:val="clear" w:color="auto" w:fill="EEF2F8"/>
+          </w:tcPr>
+          <w:p>
+            <w:r>
+              <w:rPr>
+                <w:b/>
+                <w:color w:val="1F2D5C"/>
+                <w:sz w:val="17"/>
+              </w:rPr>
+              <w:t>Como conferir</w:t>
+            </w:r>
+          </w:p>
+        </w:tc>
+        <w:tc>
+          <w:tcPr>
+            <w:tcW w:type="dxa" w:w="6746"/>
+          </w:tcPr>
+          <w:p>
+            <w:r>
+              <w:rPr>
+                <w:color w:val="2C3340"/>
+                <w:sz w:val="18"/>
+              </w:rPr>
+              <w:t>Consulta → EDISON ALVES DO NASCIMENTO (1759).</w:t>
+            </w:r>
+          </w:p>
+        </w:tc>
+      </w:tr>
+      <w:tr>
+        <w:tc>
+          <w:tcPr>
+            <w:tcW w:type="dxa" w:w="2608"/>
+            <w:shd w:val="clear" w:color="auto" w:fill="EEF2F8"/>
+          </w:tcPr>
+          <w:p>
+            <w:r>
+              <w:rPr>
+                <w:b/>
+                <w:color w:val="1F2D5C"/>
+                <w:sz w:val="17"/>
+              </w:rPr>
+              <w:t>Deve mostrar (vale em qualquer base)</w:t>
+            </w:r>
+          </w:p>
+        </w:tc>
+        <w:tc>
+          <w:tcPr>
+            <w:tcW w:type="dxa" w:w="6746"/>
+          </w:tcPr>
+          <w:p>
+            <w:r>
+              <w:rPr>
+                <w:b/>
+                <w:color w:val="1E7B43"/>
+                <w:sz w:val="18"/>
+              </w:rPr>
+              <w:t>Uma função só: A Receber 2 + SIG, com o Oracle dentro dela. Antes aparecia também “A Receber 1”, que não é a dele.</w:t>
+            </w:r>
+          </w:p>
+        </w:tc>
+      </w:tr>
+      <w:tr>
+        <w:tc>
+          <w:tcPr>
+            <w:tcW w:type="dxa" w:w="2608"/>
+            <w:shd w:val="clear" w:color="auto" w:fill="1F2D5C"/>
+          </w:tcPr>
+          <w:p>
+            <w:r>
+              <w:rPr>
+                <w:b/>
+                <w:color w:val="FFFFFF"/>
+                <w:sz w:val="17"/>
+              </w:rPr>
+              <w:t>A regra está correta? Se não, qual deveria ser?</w:t>
+            </w:r>
+          </w:p>
+        </w:tc>
+        <w:tc>
+          <w:tcPr>
+            <w:tcW w:type="dxa" w:w="6746"/>
+            <w:shd w:val="clear" w:color="auto" w:fill="FCF9EE"/>
+          </w:tcPr>
+          <w:p>
+            <w:r>
+              <w:rPr>
+                <w:color w:val="2C3340"/>
+                <w:sz w:val="18"/>
+              </w:rPr>
+            </w:r>
+          </w:p>
+        </w:tc>
+      </w:tr>
+    </w:tbl>
+    <w:p>
+      <w:r>
+        <w:br w:type="page"/>
+      </w:r>
+    </w:p>
+    <w:p>
+      <w:pPr>
+        <w:pStyle w:val="Heading1"/>
+      </w:pPr>
+      <w:r>
+        <w:rPr>
+          <w:color w:val="1F2D5C"/>
+        </w:rPr>
+        <w:t>3. O que vai parecer diferente — e por quê</w:t>
       </w:r>
     </w:p>
     <w:p>
@@ -1715,7 +3033,7 @@
           <w:color w:val="2C3340"/>
           <w:sz w:val="20"/>
         </w:rPr>
-        <w:t>Três mudanças alteram números que você acompanha. Nenhuma delas é erro; todas vêm dos pontos acima.</w:t>
+        <w:t>Estas mudanças alteram números que você acompanha. Nenhuma delas é erro; todas vêm dos pontos acima.</w:t>
       </w:r>
     </w:p>
     <w:p>
@@ -1727,7 +3045,7 @@
           <w:color w:val="2C3340"/>
           <w:sz w:val="19"/>
         </w:rPr>
-        <w:t>O total de linhas cai de 14.176 para 11.732. São os acessos de função que não é da pessoa (item 1.5) e os do Oracle que o perfil do SYSTUR não autoriza (item 1.3).</w:t>
+        <w:t>O total de linhas cai de 14.176 para 12.310. São os acessos de função que não é da pessoa (item 1.5) e os do Oracle que o perfil do SYSTUR não autoriza (item 1.3).</w:t>
       </w:r>
     </w:p>
     <w:p>
@@ -1739,7 +3057,7 @@
           <w:color w:val="2C3340"/>
           <w:sz w:val="19"/>
         </w:rPr>
-        <w:t>As pendências SOBEM: de 1.151 para 1.289 pessoas. A maior parte são as 190 pessoas que têm Oracle e não têm perfil no SYSTUR.</w:t>
+        <w:t>As pendências SOBEM: de 1.151 para 1.278 pessoas. A maior parte são as 185 pessoas que têm Oracle e não têm perfil no SYSTUR.</w:t>
       </w:r>
     </w:p>
     <w:p>
@@ -1751,7 +3069,19 @@
           <w:color w:val="2C3340"/>
           <w:sz w:val="19"/>
         </w:rPr>
-        <w:t>BRENDA VASCONCELOS DERENCIO passa a aparecer como pendência no Oracle. O único acesso dela fora do previsto é o CVC OIE BRASIL - Relatório de Despesas. Esse mesmo acesso responde por 76 das divergências do Oracle — 373 das 457 pessoas com Oracle o têm. Se ele for um acesso corporativo que não deve ser cobrado, a aplicação já tem onde configurar isso e a fila do Oracle cai de 99 para 18 pessoas.</w:t>
+        <w:t>Aparecem linhas novas de Opera Operacional (149 pessoas) e de “não tem mapeado na matriz” no Oracle (61 pessoas) — as duas informativas.</w:t>
+      </w:r>
+    </w:p>
+    <w:p>
+      <w:pPr>
+        <w:pStyle w:val="ListBullet"/>
+      </w:pPr>
+      <w:r>
+        <w:rPr>
+          <w:color w:val="2C3340"/>
+          <w:sz w:val="19"/>
+        </w:rPr>
+        <w:t>Aparecem 7 pendências novas de “não pode ter acesso e tem”.</w:t>
       </w:r>
     </w:p>
     <w:p>
@@ -1767,7 +3097,7 @@
         <w:rPr>
           <w:color w:val="1F2D5C"/>
         </w:rPr>
-        <w:t>3. Três perguntas para você</w:t>
+        <w:t>4. Duas perguntas para você</w:t>
       </w:r>
     </w:p>
     <w:p>
@@ -1780,7 +3110,7 @@
           <w:color w:val="1F2D5C"/>
           <w:sz w:val="21"/>
         </w:rPr>
-        <w:t>3.1 O Relatório de Despesas deve contar como pendência?</w:t>
+        <w:t>4.1 O Relatório de Despesas deve contar como pendência?</w:t>
       </w:r>
     </w:p>
     <w:p>
@@ -1794,7 +3124,7 @@
           <w:color w:val="2C3340"/>
           <w:sz w:val="19"/>
         </w:rPr>
-        <w:t>Hoje conta. São 373 das 457 pessoas com Oracle que têm esse acesso, e 278 têm só ele. Se for corporativo, ele deixa de contar e a fila do Oracle cai de 99 para 18 pessoas.</w:t>
+        <w:t>Hoje conta para quem passa pela regra do SYSTUR. São 373 das 457 pessoas com Oracle que têm esse acesso. Se for corporativo, ele deixa de contar e a fila do Oracle diminui bastante.</w:t>
       </w:r>
     </w:p>
     <w:p>
@@ -1821,7 +3151,7 @@
           <w:color w:val="1F2D5C"/>
           <w:sz w:val="21"/>
         </w:rPr>
-        <w:t>3.2 No SIG, os perfis são alternativos ou se somam?</w:t>
+        <w:t>4.2 No SIG, os perfis são alternativos ou se somam?</w:t>
       </w:r>
     </w:p>
     <w:p>
@@ -1836,47 +3166,6 @@
           <w:sz w:val="19"/>
         </w:rPr>
         <w:t>Hoje ter mais de um perfil no mesmo sistema vira pendência, e no SIG isso são 230 linhas. Mas 47% das pessoas com SIG têm mais de um (média de 18,7), e os nomes parecem permissões que se somam (ACESSO_CARRO_INTER_GRUPOS, CAD_FORNECEDOR_SALVAR). No SYSTUR, onde a regra faz sentido, são 1%.</w:t>
-      </w:r>
-    </w:p>
-    <w:p>
-      <w:pPr>
-        <w:spacing w:after="80"/>
-      </w:pPr>
-      <w:r>
-        <w:rPr>
-          <w:b w:val="0"/>
-          <w:i w:val="0"/>
-          <w:color w:val="5A6478"/>
-          <w:sz w:val="19"/>
-        </w:rPr>
-        <w:t>Sua resposta: ______________________________________________</w:t>
-      </w:r>
-    </w:p>
-    <w:p>
-      <w:pPr>
-        <w:spacing w:before="180" w:after="40"/>
-      </w:pPr>
-      <w:r>
-        <w:rPr>
-          <w:b/>
-          <w:color w:val="1F2D5C"/>
-          <w:sz w:val="21"/>
-        </w:rPr>
-        <w:t>3.3 Quando a matriz por cargo lista dois perfis do mesmo sistema, eles são alternativas?</w:t>
-      </w:r>
-    </w:p>
-    <w:p>
-      <w:pPr>
-        <w:spacing w:after="80"/>
-      </w:pPr>
-      <w:r>
-        <w:rPr>
-          <w:b w:val="0"/>
-          <w:i w:val="0"/>
-          <w:color w:val="2C3340"/>
-          <w:sz w:val="19"/>
-        </w:rPr>
-        <w:t>Exemplo: GILDA TAVARES DA SILVA tem INTERCOMPANY no SYSTUR e a tela diz “Falta 1: CUSTOS”. Se os dois forem alternativas, a sugestão está errada — e seguir por ela criaria uma pendência de “mais de um perfil”.</w:t>
       </w:r>
     </w:p>
     <w:p>

</xml_diff>